<commit_message>
feat(blueprints): update legal document templates
Update the .docx binary files for several contract types, including private use contracts, used car contracts, chattel mortgages (garantía mobiliaria), and debt acknowledgments. These changes refresh the templates across gender-specific and plural variations.
</commit_message>
<xml_diff>
--- a/apps/legal-docs-blueprints/templates/garantia_mobiliaria/garantia_mobiliaria-mujer-plural.docx
+++ b/apps/legal-docs-blueprints/templates/garantia_mobiliaria/garantia_mobiliaria-mujer-plural.docx
@@ -169,15 +169,25 @@
           <w:szCs w:val="20"/>
         </w:rPr>
       </w:pPr>
-      <w:r>
-        <w:rPr>
-          <w:rFonts w:eastAsia="Arial" w:cs="Arial" w:ascii="Arial" w:hAnsi="Arial"/>
-          <w:b/>
-          <w:color w:val="000000"/>
-          <w:sz w:val="20"/>
-          <w:szCs w:val="20"/>
-        </w:rPr>
-        <w:t>JOSÉ ANDRES ASENSIO HERNÁNDEZ</w:t>
+      <w:bookmarkStart w:id="0" w:name="docs-internal-guid-126b7316-7fff-5f1c-e2"/>
+      <w:bookmarkEnd w:id="0"/>
+      <w:r>
+        <w:rPr>
+          <w:rFonts w:eastAsia="Arial" w:cs="Arial" w:ascii="Arial" w:hAnsi="Arial"/>
+          <w:b/>
+          <w:i w:val="false"/>
+          <w:caps w:val="false"/>
+          <w:smallCaps w:val="false"/>
+          <w:strike w:val="false"/>
+          <w:dstrike w:val="false"/>
+          <w:color w:val="000000"/>
+          <w:sz w:val="20"/>
+          <w:szCs w:val="20"/>
+          <w:u w:val="none"/>
+          <w:effect w:val="none"/>
+          <w:shd w:fill="FFFFFF" w:val="clear"/>
+        </w:rPr>
+        <w:t>LUCRECIA MARISOL CUX TECÚN</w:t>
       </w:r>
       <w:r>
         <w:rPr>
@@ -203,45 +213,117 @@
           <w:sz w:val="20"/>
           <w:szCs w:val="20"/>
         </w:rPr>
-        <w:t xml:space="preserve"> años de edad, casado, Comerciante, guatemalteco, con domicilio en el departamento de Guatemala, me identifico con el Documento Personal de Identificación, Código Único de Identificación dos mil quinientos cincuenta y tres, cero cinco mil cincuenta y dos, cero ciento uno, extendido por el Registro Nacional de las Personas –RENAP- República de Guatemala, Centroamérica. Actúo en mi calidad de </w:t>
-      </w:r>
-      <w:r>
-        <w:rPr>
-          <w:rFonts w:eastAsia="Arial" w:cs="Arial" w:ascii="Arial" w:hAnsi="Arial"/>
-          <w:b/>
-          <w:color w:val="000000"/>
-          <w:sz w:val="20"/>
-          <w:szCs w:val="20"/>
-        </w:rPr>
-        <w:t xml:space="preserve">Administrador Único y Representante Legal </w:t>
-      </w:r>
-      <w:r>
-        <w:rPr>
-          <w:rFonts w:eastAsia="Arial" w:cs="Arial" w:ascii="Arial" w:hAnsi="Arial"/>
-          <w:color w:val="000000"/>
-          <w:sz w:val="20"/>
-          <w:szCs w:val="20"/>
+        <w:t xml:space="preserve"> </w:t>
+      </w:r>
+      <w:bookmarkStart w:id="1" w:name="docs-internal-guid-e1a7246d-7fff-9c7f-21"/>
+      <w:bookmarkEnd w:id="1"/>
+      <w:r>
+        <w:rPr>
+          <w:rFonts w:eastAsia="Arial" w:cs="Arial" w:ascii="Arial;sans-serif" w:hAnsi="Arial;sans-serif"/>
+          <w:b w:val="false"/>
+          <w:i w:val="false"/>
+          <w:caps w:val="false"/>
+          <w:smallCaps w:val="false"/>
+          <w:strike w:val="false"/>
+          <w:dstrike w:val="false"/>
+          <w:color w:val="000000"/>
+          <w:sz w:val="20"/>
+          <w:szCs w:val="20"/>
+          <w:u w:val="none"/>
+          <w:effect w:val="none"/>
+          <w:shd w:fill="FFFFFF" w:val="clear"/>
+        </w:rPr>
+        <w:t xml:space="preserve">años de edad, soltera, comerciante, guatemalteca, de este domicilio, me identifico con Documento Personal de Identificación, Código Único de Identificación dos mil seiscientos noventa y seis, noventa mil seiscientos tres, cero ciento dieciséis, extendido por el Registro Nacional de las Personas –RENAP-, República de Guatemala, Centroamérica, Actúo en mi calidad de </w:t>
+      </w:r>
+      <w:r>
+        <w:rPr>
+          <w:rFonts w:eastAsia="Arial" w:cs="Arial" w:ascii="Arial;sans-serif" w:hAnsi="Arial;sans-serif"/>
+          <w:b/>
+          <w:i w:val="false"/>
+          <w:caps w:val="false"/>
+          <w:smallCaps w:val="false"/>
+          <w:strike w:val="false"/>
+          <w:dstrike w:val="false"/>
+          <w:color w:val="000000"/>
+          <w:sz w:val="20"/>
+          <w:szCs w:val="20"/>
+          <w:u w:val="none"/>
+          <w:effect w:val="none"/>
+          <w:shd w:fill="FFFFFF" w:val="clear"/>
+        </w:rPr>
+        <w:t xml:space="preserve">Gerente Administrativo y Representante Legal </w:t>
+      </w:r>
+      <w:r>
+        <w:rPr>
+          <w:rFonts w:eastAsia="Arial" w:cs="Arial" w:ascii="Arial;sans-serif" w:hAnsi="Arial;sans-serif"/>
+          <w:b w:val="false"/>
+          <w:i w:val="false"/>
+          <w:caps w:val="false"/>
+          <w:smallCaps w:val="false"/>
+          <w:strike w:val="false"/>
+          <w:dstrike w:val="false"/>
+          <w:color w:val="000000"/>
+          <w:sz w:val="20"/>
+          <w:szCs w:val="20"/>
+          <w:u w:val="none"/>
+          <w:effect w:val="none"/>
+          <w:shd w:fill="FFFFFF" w:val="clear"/>
         </w:rPr>
         <w:t xml:space="preserve">de la entidad denominada </w:t>
       </w:r>
       <w:r>
         <w:rPr>
-          <w:rFonts w:eastAsia="Arial" w:cs="Arial" w:ascii="Arial" w:hAnsi="Arial"/>
-          <w:b/>
-          <w:color w:val="000000"/>
-          <w:sz w:val="20"/>
-          <w:szCs w:val="20"/>
+          <w:rFonts w:eastAsia="Arial" w:cs="Arial" w:ascii="Arial;sans-serif" w:hAnsi="Arial;sans-serif"/>
+          <w:b/>
+          <w:i w:val="false"/>
+          <w:caps w:val="false"/>
+          <w:smallCaps w:val="false"/>
+          <w:strike w:val="false"/>
+          <w:dstrike w:val="false"/>
+          <w:color w:val="000000"/>
+          <w:sz w:val="20"/>
+          <w:szCs w:val="20"/>
+          <w:u w:val="none"/>
+          <w:effect w:val="none"/>
+          <w:shd w:fill="FFFFFF" w:val="clear"/>
         </w:rPr>
         <w:t>CUBE INVESTMENTS, SOCIEDAD ANÓNIMA</w:t>
       </w:r>
       <w:r>
         <w:rPr>
-          <w:rFonts w:eastAsia="Arial" w:cs="Arial" w:ascii="Arial" w:hAnsi="Arial"/>
-          <w:color w:val="000000"/>
-          <w:sz w:val="20"/>
-          <w:szCs w:val="20"/>
-        </w:rPr>
-        <w:t xml:space="preserve">, lo que acredito con el Acta Notarial en la que consta mi nombramiento, autorizada en la ciudad de Guatemala el seis de octubre del año dos mil veintitrés, por el Notario Arturo Alberto Arroyo Monahan, nombramiento que quedó inscrito en el Registro Mercantil General de la República con el registro número setecientos quince mil quinientos sesenta y dos (715562), folio novecientos noventa y siete (997), del libro ochocientos veintidós (822) de Auxiliares de Comercio, y con número de identificación tributaria (NIT) nueve millones ochocientos setenta y seis mil seiscientos cuarenta y tres guión cero (9876643-0). En el transcurso del presente contrato se nos podrán denominar indistintamente como la “Acreedora” o la “Acreedora Garantizada”; </w:t>
+          <w:rFonts w:eastAsia="Arial" w:cs="Arial" w:ascii="Arial;sans-serif" w:hAnsi="Arial;sans-serif"/>
+          <w:b w:val="false"/>
+          <w:i w:val="false"/>
+          <w:caps w:val="false"/>
+          <w:smallCaps w:val="false"/>
+          <w:strike w:val="false"/>
+          <w:dstrike w:val="false"/>
+          <w:color w:val="000000"/>
+          <w:sz w:val="20"/>
+          <w:szCs w:val="20"/>
+          <w:u w:val="none"/>
+          <w:effect w:val="none"/>
+          <w:shd w:fill="FFFFFF" w:val="clear"/>
+        </w:rPr>
+        <w:t>, lo que acredito con el Acta Notarial en la que consta mi nombramiento, autorizada en la ciudad de Guatemala el veinticuatro de febrero del año dos mil veintiséis, por el Notario Arturo Alberto Arroyo Monahan, nombramiento que quedó inscrito en el Registro Mercantil General de la República con el registro número ochocientos veintisiete mil seiscientos treinta y uno (827631), folio ocho (8), del libro ochocientos cincuenta y ocho (858) de Auxiliares de Comercio</w:t>
+      </w:r>
+      <w:r>
+        <w:rPr>
+          <w:rFonts w:eastAsia="Arial" w:cs="Arial" w:ascii="Arial;sans-serif" w:hAnsi="Arial;sans-serif"/>
+          <w:b w:val="false"/>
+          <w:i w:val="false"/>
+          <w:caps w:val="false"/>
+          <w:smallCaps w:val="false"/>
+          <w:strike w:val="false"/>
+          <w:dstrike w:val="false"/>
+          <w:color w:val="000000"/>
+          <w:sz w:val="20"/>
+          <w:szCs w:val="20"/>
+          <w:u w:val="none"/>
+          <w:effect w:val="none"/>
+          <w:shd w:fill="auto" w:val="clear"/>
+        </w:rPr>
+        <w:t xml:space="preserve">. En el transcurso del presente contrato se me podrá denominar indistintamente como la “Acreedora” o la “Acreedora Garantizada”; </w:t>
       </w:r>
     </w:p>
     <w:p>
@@ -1256,25 +1338,7 @@
           <w:sz w:val="20"/>
           <w:szCs w:val="20"/>
         </w:rPr>
-        <w:t xml:space="preserve">”). La Garantía Mobiliaria se constituye con el objeto de garantizar el fiel y exacto cumplimiento de todas las obligaciones de las DEUDORAS, en virtud del Contrato y especialmente para garantizar las amortizaciones a capital, intereses, intereses moratorios, costas, gastos, recargos, comisiones y costas procesales que se llegaren a causar, en su caso, de las obligaciones adquiridas y derivadas del Contrato. En la Garantía Mobiliaria que por este acto se constituye, se incluye todo cuanto de hecho y por derecho le corresponde al Bien otorgado en garantía. Asimismo, declaran las </w:t>
-      </w:r>
-      <w:r>
-        <w:rPr>
-          <w:rFonts w:eastAsia="Arial" w:cs="Arial" w:ascii="Arial" w:hAnsi="Arial"/>
-          <w:color w:val="000000"/>
-          <w:sz w:val="20"/>
-          <w:szCs w:val="20"/>
-        </w:rPr>
-        <w:t>deudoras</w:t>
-      </w:r>
-      <w:r>
-        <w:rPr>
-          <w:rFonts w:eastAsia="Arial" w:cs="Arial" w:ascii="Arial" w:hAnsi="Arial"/>
-          <w:color w:val="000000"/>
-          <w:sz w:val="20"/>
-          <w:szCs w:val="20"/>
-        </w:rPr>
-        <w:t>, que, si llegase a ser necesaria la ejecución de la Garantía Mobiliaria y, si como consecuencia de ella, se generase un saldo insoluto, se obliga al pago de dicho saldo insoluto, dentro del tercer día de quedar determinado y sin necesidad de cobro o requerimiento alguno. El pago deberá efectuarse en la moneda de la obligación garantizada por este acto, y en la misma dirección que tal obligación debe pagarse.</w:t>
+        <w:t>”). La Garantía Mobiliaria se constituye con el objeto de garantizar el fiel y exacto cumplimiento de todas las obligaciones de las DEUDORAS, en virtud del Contrato y especialmente para garantizar las amortizaciones a capital, intereses, intereses moratorios, costas, gastos, recargos, comisiones y costas procesales que se llegaren a causar, en su caso, de las obligaciones adquiridas y derivadas del Contrato. En la Garantía Mobiliaria que por este acto se constituye, se incluye todo cuanto de hecho y por derecho le corresponde al Bien otorgado en garantía. Asimismo, declaran las deudoras, que, si llegase a ser necesaria la ejecución de la Garantía Mobiliaria y, si como consecuencia de ella, se generase un saldo insoluto, se obliga al pago de dicho saldo insoluto, dentro del tercer día de quedar determinado y sin necesidad de cobro o requerimiento alguno. El pago deberá efectuarse en la moneda de la obligación garantizada por este acto, y en la misma dirección que tal obligación debe pagarse.</w:t>
       </w:r>
     </w:p>
     <w:p>
@@ -1959,31 +2023,41 @@
         </w:rPr>
         <w:t xml:space="preserve"> ACEPTACIÓN DE LA GARANTÍA MOBILIARIA. </w:t>
       </w:r>
-      <w:r>
-        <w:rPr>
-          <w:rFonts w:eastAsia="Arial" w:cs="Arial" w:ascii="Arial" w:hAnsi="Arial"/>
-          <w:color w:val="000000"/>
-          <w:sz w:val="20"/>
-          <w:szCs w:val="20"/>
-        </w:rPr>
-        <w:t xml:space="preserve">El señor </w:t>
-      </w:r>
-      <w:r>
-        <w:rPr>
-          <w:rFonts w:eastAsia="Arial" w:cs="Arial" w:ascii="Arial" w:hAnsi="Arial"/>
-          <w:b/>
-          <w:color w:val="000000"/>
-          <w:sz w:val="20"/>
-          <w:szCs w:val="20"/>
-        </w:rPr>
-        <w:t>JOSÉ ANDRES ASENSIO HERNÁNDEZ</w:t>
-      </w:r>
-      <w:r>
-        <w:rPr>
-          <w:rFonts w:eastAsia="Arial" w:cs="Arial" w:ascii="Arial" w:hAnsi="Arial"/>
-          <w:color w:val="000000"/>
-          <w:sz w:val="20"/>
-          <w:szCs w:val="20"/>
+      <w:bookmarkStart w:id="2" w:name="docs-internal-guid-96425d6e-7fff-9e03-54"/>
+      <w:bookmarkEnd w:id="2"/>
+      <w:r>
+        <w:rPr>
+          <w:rFonts w:eastAsia="Arial" w:cs="Arial" w:ascii="Arial;sans-serif" w:hAnsi="Arial;sans-serif"/>
+          <w:b/>
+          <w:i w:val="false"/>
+          <w:caps w:val="false"/>
+          <w:smallCaps w:val="false"/>
+          <w:strike w:val="false"/>
+          <w:dstrike w:val="false"/>
+          <w:color w:val="000000"/>
+          <w:sz w:val="20"/>
+          <w:szCs w:val="20"/>
+          <w:u w:val="none"/>
+          <w:effect w:val="none"/>
+          <w:shd w:fill="auto" w:val="clear"/>
+        </w:rPr>
+        <w:t>LUCRECIA MARISOL CUX TECÚN</w:t>
+      </w:r>
+      <w:r>
+        <w:rPr>
+          <w:rFonts w:eastAsia="Arial" w:cs="Arial" w:ascii="Arial;sans-serif" w:hAnsi="Arial;sans-serif"/>
+          <w:b w:val="false"/>
+          <w:i w:val="false"/>
+          <w:caps w:val="false"/>
+          <w:smallCaps w:val="false"/>
+          <w:strike w:val="false"/>
+          <w:dstrike w:val="false"/>
+          <w:color w:val="000000"/>
+          <w:sz w:val="20"/>
+          <w:szCs w:val="20"/>
+          <w:u w:val="none"/>
+          <w:effect w:val="none"/>
+          <w:shd w:fill="auto" w:val="clear"/>
         </w:rPr>
         <w:t>, acepta de forma expresa la Garantía Mobiliaria constituida por el presente contrato, a favor de su representada,</w:t>
       </w:r>
@@ -4281,7 +4355,7 @@
           <w:sz w:val="20"/>
           <w:szCs w:val="20"/>
         </w:rPr>
-        <w:t>JOSÉ ANDRÉS ASENSIO HERNÁNDEZ</w:t>
+        <w:t>LUCRECIA MARISOL CUX TECÚN</w:t>
       </w:r>
     </w:p>
     <w:p>
@@ -4305,7 +4379,31 @@
           <w:sz w:val="20"/>
           <w:szCs w:val="20"/>
         </w:rPr>
-        <w:t xml:space="preserve">Administrador Único y Representante Legal </w:t>
+        <w:t xml:space="preserve">Gerente Administrativo y Representante Legal </w:t>
+      </w:r>
+    </w:p>
+    <w:p>
+      <w:pPr>
+        <w:pStyle w:val="Normal"/>
+        <w:widowControl w:val="false"/>
+        <w:spacing w:lineRule="auto" w:line="360"/>
+        <w:jc w:val="both"/>
+        <w:rPr>
+          <w:rFonts w:ascii="Arial" w:hAnsi="Arial" w:eastAsia="Arial" w:cs="Arial"/>
+          <w:color w:val="000000"/>
+          <w:sz w:val="20"/>
+          <w:szCs w:val="20"/>
+        </w:rPr>
+      </w:pPr>
+      <w:r>
+        <w:rPr>
+          <w:rFonts w:eastAsia="Arial" w:cs="Arial" w:ascii="Arial" w:hAnsi="Arial"/>
+          <w:b/>
+          <w:color w:val="000000"/>
+          <w:sz w:val="20"/>
+          <w:szCs w:val="20"/>
+        </w:rPr>
+        <w:t>CUBE INVESTMENTS, SOCIEDAD ANÓNIMA</w:t>
       </w:r>
     </w:p>
     <w:p>
@@ -4328,12 +4426,10 @@
       <w:r>
         <w:rPr>
           <w:rFonts w:eastAsia="Arial" w:cs="Arial" w:ascii="Arial" w:hAnsi="Arial"/>
-          <w:b/>
-          <w:color w:val="000000"/>
-          <w:sz w:val="20"/>
-          <w:szCs w:val="20"/>
-        </w:rPr>
-        <w:t>CUBE INVESTMENTS, SOCIEDAD ANÓNIMA</w:t>
+          <w:color w:val="000000"/>
+          <w:sz w:val="20"/>
+          <w:szCs w:val="20"/>
+        </w:rPr>
       </w:r>
     </w:p>
     <w:p>
@@ -4361,35 +4457,9 @@
           <w:szCs w:val="20"/>
         </w:rPr>
       </w:r>
-    </w:p>
-    <w:p>
-      <w:pPr>
-        <w:pStyle w:val="Normal"/>
-        <w:widowControl w:val="false"/>
-        <w:tabs>
-          <w:tab w:val="clear" w:pos="720"/>
-          <w:tab w:val="left" w:pos="2268" w:leader="none"/>
-        </w:tabs>
-        <w:spacing w:lineRule="auto" w:line="360"/>
-        <w:jc w:val="both"/>
-        <w:rPr>
-          <w:rFonts w:ascii="Arial" w:hAnsi="Arial" w:eastAsia="Arial" w:cs="Arial"/>
-          <w:color w:val="000000"/>
-          <w:sz w:val="20"/>
-          <w:szCs w:val="20"/>
-        </w:rPr>
-      </w:pPr>
-      <w:r>
-        <w:rPr>
-          <w:rFonts w:eastAsia="Arial" w:cs="Arial" w:ascii="Arial" w:hAnsi="Arial"/>
-          <w:color w:val="000000"/>
-          <w:sz w:val="20"/>
-          <w:szCs w:val="20"/>
-        </w:rPr>
-      </w:r>
-      <w:bookmarkStart w:id="0" w:name="_heading=h.uur5qj5iugpw"/>
-      <w:bookmarkStart w:id="1" w:name="_heading=h.uur5qj5iugpw"/>
-      <w:bookmarkEnd w:id="1"/>
+      <w:bookmarkStart w:id="3" w:name="_heading=h.uur5qj5iugpw"/>
+      <w:bookmarkStart w:id="4" w:name="_heading=h.uur5qj5iugpw"/>
+      <w:bookmarkEnd w:id="4"/>
     </w:p>
     <w:p>
       <w:pPr>
@@ -4567,14 +4637,7 @@
                 <w:rFonts w:ascii="Arial" w:hAnsi="Arial"/>
                 <w:sz w:val="20"/>
               </w:rPr>
-              <w:t>f</w:t>
-            </w:r>
-            <w:r>
-              <w:rPr>
-                <w:rFonts w:ascii="Arial" w:hAnsi="Arial"/>
-                <w:sz w:val="20"/>
-              </w:rPr>
-              <w:t>)________________________</w:t>
+              <w:t>f)________________________</w:t>
             </w:r>
           </w:p>
           <w:p>
@@ -4654,14 +4717,7 @@
                 <w:rFonts w:ascii="Arial" w:hAnsi="Arial"/>
                 <w:sz w:val="20"/>
               </w:rPr>
-              <w:t>f</w:t>
-            </w:r>
-            <w:r>
-              <w:rPr>
-                <w:rFonts w:ascii="Arial" w:hAnsi="Arial"/>
-                <w:sz w:val="20"/>
-              </w:rPr>
-              <w:t>)________________________</w:t>
+              <w:t>f)________________________</w:t>
             </w:r>
           </w:p>
           <w:p>
@@ -4826,7 +4882,7 @@
         <w:rFonts w:eastAsia="Quattrocento Sans" w:cs="Quattrocento Sans" w:ascii="Quattrocento Sans" w:hAnsi="Quattrocento Sans"/>
         <w:color w:val="000000"/>
       </w:rPr>
-      <w:t>7</w:t>
+      <w:t>8</w:t>
     </w:r>
     <w:r>
       <w:rPr>
@@ -4967,7 +5023,7 @@
         <w:rFonts w:eastAsia="Quattrocento Sans" w:cs="Quattrocento Sans" w:ascii="Quattrocento Sans" w:hAnsi="Quattrocento Sans"/>
         <w:color w:val="000000"/>
       </w:rPr>
-      <w:t>7</w:t>
+      <w:t>8</w:t>
     </w:r>
     <w:r>
       <w:rPr>

</xml_diff>